<commit_message>
fixed ppt and report
</commit_message>
<xml_diff>
--- a/reports/project_report/Heart_Disease_Risk_Modelling_Report.docx
+++ b/reports/project_report/Heart_Disease_Risk_Modelling_Report.docx
@@ -49,21 +49,53 @@
         <w:rPr>
           <w:b/>
         </w:rPr>
-        <w:t xml:space="preserve">Roll numbers:  </w:t>
-      </w:r>
-      <w:r>
-        <w:t>[add]</w:t>
-      </w:r>
+        <w:t xml:space="preserve">Roll numbers: </w:t>
+      </w:r>
+      <w:proofErr w:type="gramStart"/>
+      <w:r>
+        <w:rPr>
+          <w:b/>
+        </w:rPr>
+        <w:t>2401010176,  2401010121,  2401010230,</w:t>
+      </w:r>
+      <w:r>
+        <w:t xml:space="preserve"> </w:t>
+      </w:r>
+      <w:r>
+        <w:t xml:space="preserve"> </w:t>
+      </w:r>
+      <w:r>
+        <w:rPr>
+          <w:b/>
+        </w:rPr>
+        <w:t>2401010494</w:t>
+      </w:r>
+      <w:r>
+        <w:rPr>
+          <w:b/>
+        </w:rPr>
+        <w:t xml:space="preserve">,  </w:t>
+      </w:r>
+      <w:r>
+        <w:rPr>
+          <w:b/>
+        </w:rPr>
+        <w:t>2401010205</w:t>
+      </w:r>
+      <w:proofErr w:type="gramEnd"/>
     </w:p>
     <w:p>
+      <w:pPr>
+        <w:spacing w:after="0"/>
+      </w:pPr>
       <w:r>
         <w:rPr>
           <w:b/>
         </w:rPr>
-        <w:t xml:space="preserve">Course:  </w:t>
-      </w:r>
-      <w:r>
-        <w:t>[course name and code]</w:t>
+        <w:t xml:space="preserve">Supervisor:  </w:t>
+      </w:r>
+      <w:r>
+        <w:t xml:space="preserve">Mr. Shobhit Jhori </w:t>
       </w:r>
     </w:p>
     <w:p>
@@ -71,10 +103,18 @@
         <w:rPr>
           <w:b/>
         </w:rPr>
-        <w:t xml:space="preserve">Supervisor:  </w:t>
-      </w:r>
-      <w:r>
-        <w:t>[teacher's name]</w:t>
+        <w:t xml:space="preserve">Institution:  </w:t>
+      </w:r>
+      <w:r>
+        <w:t xml:space="preserve">Newton School Of Technology, </w:t>
+      </w:r>
+      <w:proofErr w:type="spellStart"/>
+      <w:r>
+        <w:t>Rishihood</w:t>
+      </w:r>
+      <w:proofErr w:type="spellEnd"/>
+      <w:r>
+        <w:t xml:space="preserve"> University</w:t>
       </w:r>
     </w:p>
     <w:p>
@@ -82,32 +122,10 @@
         <w:rPr>
           <w:b/>
         </w:rPr>
-        <w:t xml:space="preserve">Institution:  </w:t>
-      </w:r>
-      <w:r>
-        <w:t>[department, institution]</w:t>
-      </w:r>
-    </w:p>
-    <w:p>
-      <w:r>
-        <w:rPr>
-          <w:b/>
-        </w:rPr>
         <w:t xml:space="preserve">Date:  </w:t>
       </w:r>
       <w:r>
         <w:t>26 October 2026</w:t>
-      </w:r>
-    </w:p>
-    <w:p/>
-    <w:p>
-      <w:r>
-        <w:rPr>
-          <w:i/>
-          <w:color w:val="5B6475"/>
-          <w:sz w:val="20"/>
-        </w:rPr>
-        <w:t>This is an academic machine-learning study on a public dataset. It is not a clinically validated diagnostic system and must not be used for medical decisions.</w:t>
       </w:r>
     </w:p>
     <w:p>
@@ -187,10 +205,31 @@
     </w:p>
     <w:p>
       <w:r>
-        <w:t>All six models discriminate well: pooled out-of-fold ROC AUC ranges from 0.890 (Gradient Boosting) to 0.910 (Bayesian network), and accuracy from 81.8% to 84.9% (SVM). In paired patient-level bootstrap comparisons, five of the six models cannot be told apart; every difference whose 95% interval excludes zero involves Gradient Boosting, which is slightly behind. The three most important predictors are the same for every model examined (number of vessels coloured by fluoroscopy, thallium scan result and chest</w:t>
-      </w:r>
-      <w:r>
-        <w:t xml:space="preserve"> pain type). With one centre, 303 patients and no external validation, these are internal estimates for an academic comparison and do not demonstrate clinical validity. The project also delivers tested, reproducible code and an interactive Streamlit web application.</w:t>
+        <w:t xml:space="preserve">All six models discriminate well: pooled out-of-fold ROC AUC ranges from 0.890 (Gradient Boosting) to 0.910 (Bayesian network), and accuracy from 81.8% to 84.9% (SVM). In paired patient-level bootstrap comparisons, five of the six models cannot be told apart; every difference whose 95% interval excludes zero involves Gradient Boosting, which is slightly behind. The three most important predictors are the same for every model examined (number of vessels </w:t>
+      </w:r>
+      <w:proofErr w:type="spellStart"/>
+      <w:r>
+        <w:t>coloured</w:t>
+      </w:r>
+      <w:proofErr w:type="spellEnd"/>
+      <w:r>
+        <w:t xml:space="preserve"> by fluoroscopy, thallium scan result and chest pain type). With one </w:t>
+      </w:r>
+      <w:proofErr w:type="spellStart"/>
+      <w:r>
+        <w:t>centre</w:t>
+      </w:r>
+      <w:proofErr w:type="spellEnd"/>
+      <w:r>
+        <w:t xml:space="preserve">, 303 patients and no external validation, these are internal estimates for an academic comparison and do not demonstrate clinical validity. The project also delivers tested, reproducible code and an interactive </w:t>
+      </w:r>
+      <w:proofErr w:type="spellStart"/>
+      <w:r>
+        <w:t>Streamlit</w:t>
+      </w:r>
+      <w:proofErr w:type="spellEnd"/>
+      <w:r>
+        <w:t xml:space="preserve"> web application.</w:t>
       </w:r>
     </w:p>
     <w:p>
@@ -2415,6 +2454,7 @@
       </w:pPr>
       <w:bookmarkStart w:id="1" w:name="_Toc243918084"/>
       <w:r>
+        <w:lastRenderedPageBreak/>
         <w:t>1. Introduction and research motivation</w:t>
       </w:r>
       <w:bookmarkEnd w:id="1"/>
@@ -2521,7 +2561,15 @@
         <w:spacing w:after="60"/>
       </w:pPr>
       <w:r>
-        <w:t>Explain which features the models rely on, and package the work as tested software with a web interface.</w:t>
+        <w:t xml:space="preserve">Explain which features the models rely </w:t>
+      </w:r>
+      <w:proofErr w:type="gramStart"/>
+      <w:r>
+        <w:t>on, and</w:t>
+      </w:r>
+      <w:proofErr w:type="gramEnd"/>
+      <w:r>
+        <w:t xml:space="preserve"> package the work as tested software with a web interface.</w:t>
       </w:r>
     </w:p>
     <w:p>
@@ -2553,7 +2601,15 @@
         <w:t>Probabilistic graphical models.</w:t>
       </w:r>
       <w:r>
-        <w:t xml:space="preserve"> Pearl [4] and Koller and Friedman [5] give the theory of Bayesian networks and exact inference. Heckerman et al. [6] show how domain knowledge and data can be combined, which motivates fixing the structure from domain knowledge and learning only the probability tables. Domingos and Pazzani [7] explain why Naive Bayes classifies well even when its independence assumption is false.</w:t>
+        <w:t xml:space="preserve"> Pearl [4] and Koller and Friedman [5] give the theory of Bayesian networks and exact inference. Heckerman et al. [6] show how domain knowledge and data can be combined, which motivates fixing the structure from domain knowledge and learning only the probability tables. Domingos and </w:t>
+      </w:r>
+      <w:proofErr w:type="spellStart"/>
+      <w:r>
+        <w:t>Pazzani</w:t>
+      </w:r>
+      <w:proofErr w:type="spellEnd"/>
+      <w:r>
+        <w:t xml:space="preserve"> [7] explain why Naive Bayes classifies well even when its independence assumption is false.</w:t>
       </w:r>
     </w:p>
     <w:p>
@@ -2603,23 +2659,44 @@
       <w:r>
         <w:t xml:space="preserve">We use </w:t>
       </w:r>
+      <w:proofErr w:type="spellStart"/>
+      <w:proofErr w:type="gramStart"/>
       <w:r>
         <w:rPr>
           <w:rFonts w:ascii="Consolas" w:hAnsi="Consolas"/>
           <w:sz w:val="20"/>
         </w:rPr>
-        <w:t>processed.cleveland.data</w:t>
-      </w:r>
-      <w:r>
-        <w:t xml:space="preserve"> from the UCI Heart Disease archive (licence CC BY 4.0). The archive itself warns that the unprocessed </w:t>
-      </w:r>
+        <w:t>processed.cleveland</w:t>
+      </w:r>
+      <w:proofErr w:type="gramEnd"/>
       <w:r>
         <w:rPr>
           <w:rFonts w:ascii="Consolas" w:hAnsi="Consolas"/>
           <w:sz w:val="20"/>
         </w:rPr>
+        <w:t>.data</w:t>
+      </w:r>
+      <w:proofErr w:type="spellEnd"/>
+      <w:r>
+        <w:t xml:space="preserve"> from the UCI Heart Disease archive (</w:t>
+      </w:r>
+      <w:proofErr w:type="spellStart"/>
+      <w:r>
+        <w:t>licence</w:t>
+      </w:r>
+      <w:proofErr w:type="spellEnd"/>
+      <w:r>
+        <w:t xml:space="preserve"> CC BY 4.0). The archive itself warns that the unprocessed </w:t>
+      </w:r>
+      <w:proofErr w:type="spellStart"/>
+      <w:r>
+        <w:rPr>
+          <w:rFonts w:ascii="Consolas" w:hAnsi="Consolas"/>
+          <w:sz w:val="20"/>
+        </w:rPr>
         <w:t>cleveland.data</w:t>
       </w:r>
+      <w:proofErr w:type="spellEnd"/>
       <w:r>
         <w:t xml:space="preserve"> is corrupted. The file has no header; columns are assigned in the documented order (Table 1).</w:t>
       </w:r>
@@ -2739,8 +2816,58 @@
               <w:rPr>
                 <w:sz w:val="19"/>
               </w:rPr>
-              <w:t>age, trestbps, chol, thalach, oldpeak</w:t>
-            </w:r>
+              <w:t xml:space="preserve">age, </w:t>
+            </w:r>
+            <w:proofErr w:type="spellStart"/>
+            <w:r>
+              <w:rPr>
+                <w:sz w:val="19"/>
+              </w:rPr>
+              <w:t>trestbps</w:t>
+            </w:r>
+            <w:proofErr w:type="spellEnd"/>
+            <w:r>
+              <w:rPr>
+                <w:sz w:val="19"/>
+              </w:rPr>
+              <w:t xml:space="preserve">, </w:t>
+            </w:r>
+            <w:proofErr w:type="spellStart"/>
+            <w:r>
+              <w:rPr>
+                <w:sz w:val="19"/>
+              </w:rPr>
+              <w:t>chol</w:t>
+            </w:r>
+            <w:proofErr w:type="spellEnd"/>
+            <w:r>
+              <w:rPr>
+                <w:sz w:val="19"/>
+              </w:rPr>
+              <w:t xml:space="preserve">, </w:t>
+            </w:r>
+            <w:proofErr w:type="spellStart"/>
+            <w:r>
+              <w:rPr>
+                <w:sz w:val="19"/>
+              </w:rPr>
+              <w:t>thalach</w:t>
+            </w:r>
+            <w:proofErr w:type="spellEnd"/>
+            <w:r>
+              <w:rPr>
+                <w:sz w:val="19"/>
+              </w:rPr>
+              <w:t xml:space="preserve">, </w:t>
+            </w:r>
+            <w:proofErr w:type="spellStart"/>
+            <w:r>
+              <w:rPr>
+                <w:sz w:val="19"/>
+              </w:rPr>
+              <w:t>oldpeak</w:t>
+            </w:r>
+            <w:proofErr w:type="spellEnd"/>
           </w:p>
         </w:tc>
         <w:tc>
@@ -2794,8 +2921,30 @@
               <w:rPr>
                 <w:sz w:val="19"/>
               </w:rPr>
-              <w:t>sex, fbs, exang</w:t>
-            </w:r>
+              <w:t xml:space="preserve">sex, </w:t>
+            </w:r>
+            <w:proofErr w:type="spellStart"/>
+            <w:r>
+              <w:rPr>
+                <w:sz w:val="19"/>
+              </w:rPr>
+              <w:t>fbs</w:t>
+            </w:r>
+            <w:proofErr w:type="spellEnd"/>
+            <w:r>
+              <w:rPr>
+                <w:sz w:val="19"/>
+              </w:rPr>
+              <w:t xml:space="preserve">, </w:t>
+            </w:r>
+            <w:proofErr w:type="spellStart"/>
+            <w:r>
+              <w:rPr>
+                <w:sz w:val="19"/>
+              </w:rPr>
+              <w:t>exang</w:t>
+            </w:r>
+            <w:proofErr w:type="spellEnd"/>
           </w:p>
         </w:tc>
         <w:tc>
@@ -2864,7 +3013,21 @@
               <w:rPr>
                 <w:sz w:val="19"/>
               </w:rPr>
-              <w:t>vessels coloured by fluoroscopy (0-3); slope of peak-exercise ST segment</w:t>
+              <w:t xml:space="preserve">vessels </w:t>
+            </w:r>
+            <w:proofErr w:type="spellStart"/>
+            <w:r>
+              <w:rPr>
+                <w:sz w:val="19"/>
+              </w:rPr>
+              <w:t>coloured</w:t>
+            </w:r>
+            <w:proofErr w:type="spellEnd"/>
+            <w:r>
+              <w:rPr>
+                <w:sz w:val="19"/>
+              </w:rPr>
+              <w:t xml:space="preserve"> by fluoroscopy (0-3); slope of peak-exercise ST segment</w:t>
             </w:r>
           </w:p>
         </w:tc>
@@ -2903,8 +3066,30 @@
               <w:rPr>
                 <w:sz w:val="19"/>
               </w:rPr>
-              <w:t>cp, restecg, thal</w:t>
-            </w:r>
+              <w:t xml:space="preserve">cp, </w:t>
+            </w:r>
+            <w:proofErr w:type="spellStart"/>
+            <w:r>
+              <w:rPr>
+                <w:sz w:val="19"/>
+              </w:rPr>
+              <w:t>restecg</w:t>
+            </w:r>
+            <w:proofErr w:type="spellEnd"/>
+            <w:r>
+              <w:rPr>
+                <w:sz w:val="19"/>
+              </w:rPr>
+              <w:t xml:space="preserve">, </w:t>
+            </w:r>
+            <w:proofErr w:type="spellStart"/>
+            <w:r>
+              <w:rPr>
+                <w:sz w:val="19"/>
+              </w:rPr>
+              <w:t>thal</w:t>
+            </w:r>
+            <w:proofErr w:type="spellEnd"/>
           </w:p>
         </w:tc>
         <w:tc>
@@ -3017,6 +3202,7 @@
       <w:r>
         <w:t xml:space="preserve"> (4) and </w:t>
       </w:r>
+      <w:proofErr w:type="spellStart"/>
       <w:r>
         <w:rPr>
           <w:rFonts w:ascii="Consolas" w:hAnsi="Consolas"/>
@@ -3024,6 +3210,7 @@
         </w:rPr>
         <w:t>thal</w:t>
       </w:r>
+      <w:proofErr w:type="spellEnd"/>
       <w:r>
         <w:t xml:space="preserve"> (2), affecting 6 rows. The diagnosis </w:t>
       </w:r>
@@ -3125,6 +3312,7 @@
       <w:r>
         <w:t xml:space="preserve">Only one predictor pair has |Spearman| &gt;= 0.5: </w:t>
       </w:r>
+      <w:proofErr w:type="spellStart"/>
       <w:r>
         <w:rPr>
           <w:rFonts w:ascii="Consolas" w:hAnsi="Consolas"/>
@@ -3132,6 +3320,7 @@
         </w:rPr>
         <w:t>oldpeak</w:t>
       </w:r>
+      <w:proofErr w:type="spellEnd"/>
       <w:r>
         <w:t xml:space="preserve"> and </w:t>
       </w:r>
@@ -3154,6 +3343,7 @@
       <w:r>
         <w:t>Several category levels are sparse (</w:t>
       </w:r>
+      <w:proofErr w:type="spellStart"/>
       <w:r>
         <w:rPr>
           <w:rFonts w:ascii="Consolas" w:hAnsi="Consolas"/>
@@ -3161,9 +3351,11 @@
         </w:rPr>
         <w:t>restecg</w:t>
       </w:r>
+      <w:proofErr w:type="spellEnd"/>
       <w:r>
         <w:t xml:space="preserve"> = 1: 4 rows; </w:t>
       </w:r>
+      <w:proofErr w:type="spellStart"/>
       <w:r>
         <w:rPr>
           <w:rFonts w:ascii="Consolas" w:hAnsi="Consolas"/>
@@ -3171,6 +3363,7 @@
         </w:rPr>
         <w:t>thal</w:t>
       </w:r>
+      <w:proofErr w:type="spellEnd"/>
       <w:r>
         <w:t xml:space="preserve"> = 6: 18; </w:t>
       </w:r>
@@ -3224,12 +3417,12 @@
           <w:rFonts w:ascii="Consolas" w:hAnsi="Consolas"/>
           <w:sz w:val="20"/>
         </w:rPr>
-        <w:lastRenderedPageBreak/>
         <w:t>ca</w:t>
       </w:r>
       <w:r>
         <w:t xml:space="preserve">, </w:t>
       </w:r>
+      <w:proofErr w:type="spellStart"/>
       <w:r>
         <w:rPr>
           <w:rFonts w:ascii="Consolas" w:hAnsi="Consolas"/>
@@ -3237,9 +3430,11 @@
         </w:rPr>
         <w:t>thal</w:t>
       </w:r>
+      <w:proofErr w:type="spellEnd"/>
       <w:r>
         <w:t xml:space="preserve">, </w:t>
       </w:r>
+      <w:proofErr w:type="spellStart"/>
       <w:r>
         <w:rPr>
           <w:rFonts w:ascii="Consolas" w:hAnsi="Consolas"/>
@@ -3247,6 +3442,7 @@
         </w:rPr>
         <w:t>oldpeak</w:t>
       </w:r>
+      <w:proofErr w:type="spellEnd"/>
       <w:r>
         <w:t xml:space="preserve">, </w:t>
       </w:r>
@@ -3260,6 +3456,7 @@
       <w:r>
         <w:t xml:space="preserve">, </w:t>
       </w:r>
+      <w:proofErr w:type="spellStart"/>
       <w:r>
         <w:rPr>
           <w:rFonts w:ascii="Consolas" w:hAnsi="Consolas"/>
@@ -3267,9 +3464,11 @@
         </w:rPr>
         <w:t>exang</w:t>
       </w:r>
+      <w:proofErr w:type="spellEnd"/>
       <w:r>
         <w:t xml:space="preserve"> and </w:t>
       </w:r>
+      <w:proofErr w:type="spellStart"/>
       <w:r>
         <w:rPr>
           <w:rFonts w:ascii="Consolas" w:hAnsi="Consolas"/>
@@ -3277,6 +3476,7 @@
         </w:rPr>
         <w:t>thalach</w:t>
       </w:r>
+      <w:proofErr w:type="spellEnd"/>
       <w:r>
         <w:t xml:space="preserve"> come from exercise testing, fluoroscopy and perfusion imaging, so the setting is a diagnostic work-up, not first-contact screening.</w:t>
       </w:r>
@@ -3290,6 +3490,7 @@
         <w:rPr>
           <w:noProof/>
         </w:rPr>
+        <w:lastRenderedPageBreak/>
         <w:drawing>
           <wp:inline distT="0" distB="0" distL="0" distR="0" wp14:anchorId="246CF1FF" wp14:editId="028C9B02">
             <wp:extent cx="4320000" cy="3510000"/>
@@ -3539,11 +3740,19 @@
             <w:pPr>
               <w:spacing w:after="0"/>
             </w:pPr>
-            <w:r>
-              <w:rPr>
-                <w:sz w:val="19"/>
-              </w:rPr>
-              <w:t>standardised (mean 0, SD 1)</w:t>
+            <w:proofErr w:type="spellStart"/>
+            <w:r>
+              <w:rPr>
+                <w:sz w:val="19"/>
+              </w:rPr>
+              <w:t>standardised</w:t>
+            </w:r>
+            <w:proofErr w:type="spellEnd"/>
+            <w:r>
+              <w:rPr>
+                <w:sz w:val="19"/>
+              </w:rPr>
+              <w:t xml:space="preserve"> (mean 0, SD 1)</w:t>
             </w:r>
           </w:p>
         </w:tc>
@@ -3593,12 +3802,14 @@
             <w:pPr>
               <w:spacing w:after="0"/>
             </w:pPr>
+            <w:proofErr w:type="spellStart"/>
             <w:r>
               <w:rPr>
                 <w:sz w:val="19"/>
               </w:rPr>
               <w:t>standardised</w:t>
             </w:r>
+            <w:proofErr w:type="spellEnd"/>
           </w:p>
         </w:tc>
         <w:tc>
@@ -3741,7 +3952,23 @@
         <w:t>Why two pipelines.</w:t>
       </w:r>
       <w:r>
-        <w:t xml:space="preserve"> Logistic Regression and the SVM are sensitive to the scale of their inputs (the L2 penalty and the RBF distance both depend on it), so features are standardised; nominal codes such as chest-pain type carry no order and are one-hot encoded. The Bayesian network and Naive Bayes estimate conditional probability tables, which need a finite number of states, so continuous features are discretised. Tree ensembles do not need scaling but share the numeric pipeline to keep the comparison simple.</w:t>
+        <w:t xml:space="preserve"> Logistic Regression and the SVM are sensitive to the scale of their inputs (the L2 penalty and the RBF distance both depend on it), so features are </w:t>
+      </w:r>
+      <w:proofErr w:type="spellStart"/>
+      <w:r>
+        <w:t>standardised</w:t>
+      </w:r>
+      <w:proofErr w:type="spellEnd"/>
+      <w:r>
+        <w:t xml:space="preserve">; nominal codes such as chest-pain type carry no order and are one-hot encoded. The Bayesian network and Naive Bayes estimate conditional probability tables, which need a finite number of states, so continuous features are </w:t>
+      </w:r>
+      <w:proofErr w:type="spellStart"/>
+      <w:r>
+        <w:t>discretised</w:t>
+      </w:r>
+      <w:proofErr w:type="spellEnd"/>
+      <w:r>
+        <w:t>. Tree ensembles do not need scaling but share the numeric pipeline to keep the comparison simple.</w:t>
       </w:r>
     </w:p>
     <w:p>
@@ -3750,14 +3977,21 @@
       </w:pPr>
       <w:bookmarkStart w:id="10" w:name="_Toc243918093"/>
       <w:r>
-        <w:lastRenderedPageBreak/>
         <w:t>5. Theoretical methodology</w:t>
       </w:r>
       <w:bookmarkEnd w:id="10"/>
     </w:p>
     <w:p>
       <w:r>
-        <w:t>All six models output a probability P(disease | x) for a patient with findings x; a patient is classified as diseased when this probability is at least 0.5.</w:t>
+        <w:t xml:space="preserve">All six models output a probability </w:t>
+      </w:r>
+      <w:proofErr w:type="gramStart"/>
+      <w:r>
+        <w:t>P(</w:t>
+      </w:r>
+      <w:proofErr w:type="gramEnd"/>
+      <w:r>
+        <w:t>disease | x) for a patient with findings x; a patient is classified as diseased when this probability is at least 0.5.</w:t>
       </w:r>
     </w:p>
     <w:p>
@@ -3769,10 +4003,43 @@
         <w:rPr>
           <w:b/>
         </w:rPr>
+        <w:lastRenderedPageBreak/>
         <w:t>Bayesian network:</w:t>
       </w:r>
       <w:r>
-        <w:t xml:space="preserve"> the joint distribution factorises over a directed acyclic graph as P(x1, ..., xn) = Π P(xi | parents(xi)). The posterior of the target given all findings is computed exactly by variable elimination.</w:t>
+        <w:t xml:space="preserve"> the joint distribution </w:t>
+      </w:r>
+      <w:proofErr w:type="spellStart"/>
+      <w:r>
+        <w:t>factorises</w:t>
+      </w:r>
+      <w:proofErr w:type="spellEnd"/>
+      <w:r>
+        <w:t xml:space="preserve"> over a directed acyclic graph as </w:t>
+      </w:r>
+      <w:proofErr w:type="gramStart"/>
+      <w:r>
+        <w:t>P(</w:t>
+      </w:r>
+      <w:proofErr w:type="gramEnd"/>
+      <w:r>
+        <w:t xml:space="preserve">x1, ..., </w:t>
+      </w:r>
+      <w:proofErr w:type="spellStart"/>
+      <w:r>
+        <w:t>xn</w:t>
+      </w:r>
+      <w:proofErr w:type="spellEnd"/>
+      <w:r>
+        <w:t xml:space="preserve">) = Π </w:t>
+      </w:r>
+      <w:proofErr w:type="gramStart"/>
+      <w:r>
+        <w:t>P(</w:t>
+      </w:r>
+      <w:proofErr w:type="gramEnd"/>
+      <w:r>
+        <w:t>xi | parents(xi)). The posterior of the target given all findings is computed exactly by variable elimination.</w:t>
       </w:r>
     </w:p>
     <w:p>
@@ -3787,7 +4054,23 @@
         <w:t>Naive Bayes:</w:t>
       </w:r>
       <w:r>
-        <w:t xml:space="preserve"> a Bayesian network in which the class is the only parent of every predictor, so P(disease | x) ∝ P(disease) Π P(xi | disease).</w:t>
+        <w:t xml:space="preserve"> a Bayesian network in which the class is the only parent of every predictor, so </w:t>
+      </w:r>
+      <w:proofErr w:type="gramStart"/>
+      <w:r>
+        <w:t>P(</w:t>
+      </w:r>
+      <w:proofErr w:type="gramEnd"/>
+      <w:r>
+        <w:t xml:space="preserve">disease | x) ∝ P(disease) Π </w:t>
+      </w:r>
+      <w:proofErr w:type="gramStart"/>
+      <w:r>
+        <w:t>P(</w:t>
+      </w:r>
+      <w:proofErr w:type="gramEnd"/>
+      <w:r>
+        <w:t>xi | disease).</w:t>
       </w:r>
     </w:p>
     <w:p>
@@ -3802,7 +4085,36 @@
         <w:t>Logistic Regression:</w:t>
       </w:r>
       <w:r>
-        <w:t xml:space="preserve"> P(disease | x) = σ(w·x + b), where σ is the logistic (sigmoid) function. Weights minimise the log loss plus an L2 penalty ||w||² / (2C).</w:t>
+        <w:t xml:space="preserve"> </w:t>
+      </w:r>
+      <w:proofErr w:type="gramStart"/>
+      <w:r>
+        <w:t>P(</w:t>
+      </w:r>
+      <w:proofErr w:type="gramEnd"/>
+      <w:r>
+        <w:t xml:space="preserve">disease | x) = </w:t>
+      </w:r>
+      <w:proofErr w:type="gramStart"/>
+      <w:r>
+        <w:t>σ(</w:t>
+      </w:r>
+      <w:proofErr w:type="spellStart"/>
+      <w:proofErr w:type="gramEnd"/>
+      <w:r>
+        <w:t>w·x</w:t>
+      </w:r>
+      <w:proofErr w:type="spellEnd"/>
+      <w:r>
+        <w:t xml:space="preserve"> + b), where σ is the logistic (sigmoid) function. Weights </w:t>
+      </w:r>
+      <w:proofErr w:type="spellStart"/>
+      <w:r>
+        <w:t>minimise</w:t>
+      </w:r>
+      <w:proofErr w:type="spellEnd"/>
+      <w:r>
+        <w:t xml:space="preserve"> the log loss plus an L2 penalty ||w||² / (2C).</w:t>
       </w:r>
     </w:p>
     <w:p>
@@ -3817,7 +4129,23 @@
         <w:t>SVM:</w:t>
       </w:r>
       <w:r>
-        <w:t xml:space="preserve"> finds the boundary with the widest margin; the RBF kernel K(x, x') = exp(-γ||x - x'||²) allows a curved boundary. C trades margin width against training errors. Platt scaling fits a sigmoid to the SVM scores to obtain probabilities.</w:t>
+        <w:t xml:space="preserve"> finds the boundary with the widest margin; the RBF kernel </w:t>
+      </w:r>
+      <w:proofErr w:type="gramStart"/>
+      <w:r>
+        <w:t>K(</w:t>
+      </w:r>
+      <w:proofErr w:type="gramEnd"/>
+      <w:r>
+        <w:t xml:space="preserve">x, x') = </w:t>
+      </w:r>
+      <w:proofErr w:type="gramStart"/>
+      <w:r>
+        <w:t>exp(</w:t>
+      </w:r>
+      <w:proofErr w:type="gramEnd"/>
+      <w:r>
+        <w:t>-γ||x - x'||²) allows a curved boundary. C trades margin width against training errors. Platt scaling fits a sigmoid to the SVM scores to obtain probabilities.</w:t>
       </w:r>
     </w:p>
     <w:p>
@@ -3891,7 +4219,15 @@
         <w:t>16 directed edges fixed before any evaluation</w:t>
       </w:r>
       <w:r>
-        <w:t>, following the convention risk factors -&gt; disease -&gt; findings (Figure 3). Only the conditional probability tables are estimated, from the training fold, with a Dirichlet prior whose pseudo-count is tuned. Inference uses pgmpy [20].</w:t>
+        <w:t xml:space="preserve">, following the convention risk factors -&gt; disease -&gt; findings (Figure 3). Only the conditional probability tables are estimated, from the training fold, with a Dirichlet prior whose pseudo-count is tuned. Inference uses </w:t>
+      </w:r>
+      <w:proofErr w:type="spellStart"/>
+      <w:r>
+        <w:t>pgmpy</w:t>
+      </w:r>
+      <w:proofErr w:type="spellEnd"/>
+      <w:r>
+        <w:t xml:space="preserve"> [20].</w:t>
       </w:r>
     </w:p>
     <w:p>
@@ -3906,7 +4242,15 @@
         <w:t>Domain edges:</w:t>
       </w:r>
       <w:r>
-        <w:t xml:space="preserve"> age, sex and chol point to </w:t>
+        <w:t xml:space="preserve"> age, sex and </w:t>
+      </w:r>
+      <w:proofErr w:type="spellStart"/>
+      <w:r>
+        <w:t>chol</w:t>
+      </w:r>
+      <w:proofErr w:type="spellEnd"/>
+      <w:r>
+        <w:t xml:space="preserve"> point to </w:t>
       </w:r>
       <w:r>
         <w:rPr>
@@ -3926,7 +4270,55 @@
         <w:t>target</w:t>
       </w:r>
       <w:r>
-        <w:t xml:space="preserve"> points to cp, exang, restecg, thal, ca, thalach, oldpeak and slope; age -&gt; thalach.</w:t>
+        <w:t xml:space="preserve"> points to cp, </w:t>
+      </w:r>
+      <w:proofErr w:type="spellStart"/>
+      <w:r>
+        <w:t>exang</w:t>
+      </w:r>
+      <w:proofErr w:type="spellEnd"/>
+      <w:r>
+        <w:t xml:space="preserve">, </w:t>
+      </w:r>
+      <w:proofErr w:type="spellStart"/>
+      <w:r>
+        <w:t>restecg</w:t>
+      </w:r>
+      <w:proofErr w:type="spellEnd"/>
+      <w:r>
+        <w:t xml:space="preserve">, </w:t>
+      </w:r>
+      <w:proofErr w:type="spellStart"/>
+      <w:r>
+        <w:t>thal</w:t>
+      </w:r>
+      <w:proofErr w:type="spellEnd"/>
+      <w:r>
+        <w:t xml:space="preserve">, ca, </w:t>
+      </w:r>
+      <w:proofErr w:type="spellStart"/>
+      <w:r>
+        <w:t>thalach</w:t>
+      </w:r>
+      <w:proofErr w:type="spellEnd"/>
+      <w:r>
+        <w:t xml:space="preserve">, </w:t>
+      </w:r>
+      <w:proofErr w:type="spellStart"/>
+      <w:r>
+        <w:t>oldpeak</w:t>
+      </w:r>
+      <w:proofErr w:type="spellEnd"/>
+      <w:r>
+        <w:t xml:space="preserve"> and slope; age -&gt; </w:t>
+      </w:r>
+      <w:proofErr w:type="spellStart"/>
+      <w:r>
+        <w:t>thalach</w:t>
+      </w:r>
+      <w:proofErr w:type="spellEnd"/>
+      <w:r>
+        <w:t>.</w:t>
       </w:r>
     </w:p>
     <w:p>
@@ -3941,7 +4333,23 @@
         <w:t>Weak edges:</w:t>
       </w:r>
       <w:r>
-        <w:t xml:space="preserve"> age -&gt; trestbps and age -&gt; fbs.</w:t>
+        <w:t xml:space="preserve"> age -&gt; </w:t>
+      </w:r>
+      <w:proofErr w:type="spellStart"/>
+      <w:r>
+        <w:t>trestbps</w:t>
+      </w:r>
+      <w:proofErr w:type="spellEnd"/>
+      <w:r>
+        <w:t xml:space="preserve"> and age -&gt; </w:t>
+      </w:r>
+      <w:proofErr w:type="spellStart"/>
+      <w:r>
+        <w:t>fbs</w:t>
+      </w:r>
+      <w:proofErr w:type="spellEnd"/>
+      <w:r>
+        <w:t>.</w:t>
       </w:r>
     </w:p>
     <w:p>
@@ -3956,7 +4364,23 @@
         <w:t>Modelling edges:</w:t>
       </w:r>
       <w:r>
-        <w:t xml:space="preserve"> cp -&gt; exang and oldpeak -&gt; slope, added to relax the Naive Bayes independence assumption. The second was suggested by the exploratory analysis.</w:t>
+        <w:t xml:space="preserve"> cp -&gt; </w:t>
+      </w:r>
+      <w:proofErr w:type="spellStart"/>
+      <w:r>
+        <w:t>exang</w:t>
+      </w:r>
+      <w:proofErr w:type="spellEnd"/>
+      <w:r>
+        <w:t xml:space="preserve"> and </w:t>
+      </w:r>
+      <w:proofErr w:type="spellStart"/>
+      <w:r>
+        <w:t>oldpeak</w:t>
+      </w:r>
+      <w:proofErr w:type="spellEnd"/>
+      <w:r>
+        <w:t xml:space="preserve"> -&gt; slope, added to relax the Naive Bayes independence assumption. The second was suggested by the exploratory analysis.</w:t>
       </w:r>
     </w:p>
     <w:p>
@@ -4050,6 +4474,7 @@
       <w:bookmarkEnd w:id="13"/>
     </w:p>
     <w:p>
+      <w:proofErr w:type="spellStart"/>
       <w:r>
         <w:rPr>
           <w:rFonts w:ascii="Consolas" w:hAnsi="Consolas"/>
@@ -4057,8 +4482,17 @@
         </w:rPr>
         <w:t>CategoricalNB</w:t>
       </w:r>
-      <w:r>
-        <w:t xml:space="preserve"> from scikit-learn [21] on the same discrete inputs, with Laplace smoothing α tuned. Because it uses exactly the same inputs as the Bayesian network, comparing the two isolates the effect of the extra edges.</w:t>
+      <w:proofErr w:type="spellEnd"/>
+      <w:r>
+        <w:t xml:space="preserve"> from scikit-learn [21] on the same discrete inputs, with Laplace smoothing α tuned. Because it uses </w:t>
+      </w:r>
+      <w:proofErr w:type="gramStart"/>
+      <w:r>
+        <w:t>exactly the same</w:t>
+      </w:r>
+      <w:proofErr w:type="gramEnd"/>
+      <w:r>
+        <w:t xml:space="preserve"> inputs as the Bayesian network, comparing the two isolates the effect of the extra edges.</w:t>
       </w:r>
     </w:p>
     <w:p>
@@ -4187,11 +4621,33 @@
             <w:pPr>
               <w:spacing w:after="0"/>
             </w:pPr>
-            <w:r>
-              <w:rPr>
-                <w:sz w:val="19"/>
-              </w:rPr>
-              <w:t>LogisticRegression, L2 penalty, lbfgs solver</w:t>
+            <w:proofErr w:type="spellStart"/>
+            <w:r>
+              <w:rPr>
+                <w:sz w:val="19"/>
+              </w:rPr>
+              <w:t>LogisticRegression</w:t>
+            </w:r>
+            <w:proofErr w:type="spellEnd"/>
+            <w:r>
+              <w:rPr>
+                <w:sz w:val="19"/>
+              </w:rPr>
+              <w:t xml:space="preserve">, L2 penalty, </w:t>
+            </w:r>
+            <w:proofErr w:type="spellStart"/>
+            <w:r>
+              <w:rPr>
+                <w:sz w:val="19"/>
+              </w:rPr>
+              <w:t>lbfgs</w:t>
+            </w:r>
+            <w:proofErr w:type="spellEnd"/>
+            <w:r>
+              <w:rPr>
+                <w:sz w:val="19"/>
+              </w:rPr>
+              <w:t xml:space="preserve"> solver</w:t>
             </w:r>
           </w:p>
         </w:tc>
@@ -4296,12 +4752,14 @@
             <w:pPr>
               <w:spacing w:after="0"/>
             </w:pPr>
+            <w:proofErr w:type="spellStart"/>
             <w:r>
               <w:rPr>
                 <w:sz w:val="19"/>
               </w:rPr>
               <w:t>RandomForestClassifier</w:t>
             </w:r>
+            <w:proofErr w:type="spellEnd"/>
           </w:p>
         </w:tc>
         <w:tc>
@@ -4312,11 +4770,33 @@
             <w:pPr>
               <w:spacing w:after="0"/>
             </w:pPr>
-            <w:r>
-              <w:rPr>
-                <w:sz w:val="19"/>
-              </w:rPr>
-              <w:t>n_estimators: 200, 500; max_depth: 3, 5, None</w:t>
+            <w:proofErr w:type="spellStart"/>
+            <w:r>
+              <w:rPr>
+                <w:sz w:val="19"/>
+              </w:rPr>
+              <w:t>n_estimators</w:t>
+            </w:r>
+            <w:proofErr w:type="spellEnd"/>
+            <w:r>
+              <w:rPr>
+                <w:sz w:val="19"/>
+              </w:rPr>
+              <w:t xml:space="preserve">: 200, 500; </w:t>
+            </w:r>
+            <w:proofErr w:type="spellStart"/>
+            <w:r>
+              <w:rPr>
+                <w:sz w:val="19"/>
+              </w:rPr>
+              <w:t>max_depth</w:t>
+            </w:r>
+            <w:proofErr w:type="spellEnd"/>
+            <w:r>
+              <w:rPr>
+                <w:sz w:val="19"/>
+              </w:rPr>
+              <w:t>: 3, 5, None</w:t>
             </w:r>
           </w:p>
         </w:tc>
@@ -4351,12 +4831,14 @@
             <w:pPr>
               <w:spacing w:after="0"/>
             </w:pPr>
+            <w:proofErr w:type="spellStart"/>
             <w:r>
               <w:rPr>
                 <w:sz w:val="19"/>
               </w:rPr>
               <w:t>GradientBoostingClassifier</w:t>
             </w:r>
+            <w:proofErr w:type="spellEnd"/>
           </w:p>
         </w:tc>
         <w:tc>
@@ -4368,11 +4850,47 @@
             <w:pPr>
               <w:spacing w:after="0"/>
             </w:pPr>
-            <w:r>
-              <w:rPr>
-                <w:sz w:val="19"/>
-              </w:rPr>
-              <w:t>learning_rate: 0.05, 0.1; n_estimators: 100, 200; max_depth: 2, 3</w:t>
+            <w:proofErr w:type="spellStart"/>
+            <w:r>
+              <w:rPr>
+                <w:sz w:val="19"/>
+              </w:rPr>
+              <w:t>learning_rate</w:t>
+            </w:r>
+            <w:proofErr w:type="spellEnd"/>
+            <w:r>
+              <w:rPr>
+                <w:sz w:val="19"/>
+              </w:rPr>
+              <w:t xml:space="preserve">: 0.05, 0.1; </w:t>
+            </w:r>
+            <w:proofErr w:type="spellStart"/>
+            <w:r>
+              <w:rPr>
+                <w:sz w:val="19"/>
+              </w:rPr>
+              <w:t>n_estimators</w:t>
+            </w:r>
+            <w:proofErr w:type="spellEnd"/>
+            <w:r>
+              <w:rPr>
+                <w:sz w:val="19"/>
+              </w:rPr>
+              <w:t xml:space="preserve">: 100, 200; </w:t>
+            </w:r>
+            <w:proofErr w:type="spellStart"/>
+            <w:r>
+              <w:rPr>
+                <w:sz w:val="19"/>
+              </w:rPr>
+              <w:t>max_depth</w:t>
+            </w:r>
+            <w:proofErr w:type="spellEnd"/>
+            <w:r>
+              <w:rPr>
+                <w:sz w:val="19"/>
+              </w:rPr>
+              <w:t>: 2, 3</w:t>
             </w:r>
           </w:p>
         </w:tc>
@@ -4389,7 +4907,6 @@
       </w:pPr>
       <w:bookmarkStart w:id="15" w:name="_Toc243918098"/>
       <w:r>
-        <w:lastRenderedPageBreak/>
         <w:t>8. Experimental design and evaluation metrics</w:t>
       </w:r>
       <w:bookmarkEnd w:id="15"/>
@@ -4428,6 +4945,7 @@
         <w:rPr>
           <w:b/>
         </w:rPr>
+        <w:lastRenderedPageBreak/>
         <w:t>Inner loop (nested tuning):</w:t>
       </w:r>
       <w:r>
@@ -4901,8 +5419,16 @@
               <w:rPr>
                 <w:sz w:val="19"/>
               </w:rPr>
-              <w:t>mean of (p - y)²</w:t>
-            </w:r>
+              <w:t xml:space="preserve">mean of (p - </w:t>
+            </w:r>
+            <w:proofErr w:type="gramStart"/>
+            <w:r>
+              <w:rPr>
+                <w:sz w:val="19"/>
+              </w:rPr>
+              <w:t>y)²</w:t>
+            </w:r>
+            <w:proofErr w:type="gramEnd"/>
           </w:p>
         </w:tc>
         <w:tc>
@@ -5660,14 +6186,7 @@
               <w:rPr>
                 <w:sz w:val="19"/>
               </w:rPr>
-              <w:t xml:space="preserve">0.834 ± </w:t>
-            </w:r>
-            <w:r>
-              <w:rPr>
-                <w:sz w:val="19"/>
-              </w:rPr>
-              <w:lastRenderedPageBreak/>
-              <w:t>0.048</w:t>
+              <w:t>0.834 ± 0.048</w:t>
             </w:r>
           </w:p>
         </w:tc>
@@ -5683,15 +6202,7 @@
               <w:rPr>
                 <w:sz w:val="19"/>
               </w:rPr>
-              <w:lastRenderedPageBreak/>
-              <w:t xml:space="preserve">0.906 ± </w:t>
-            </w:r>
-            <w:r>
-              <w:rPr>
-                <w:sz w:val="19"/>
-              </w:rPr>
-              <w:lastRenderedPageBreak/>
-              <w:t>0.037</w:t>
+              <w:t>0.906 ± 0.037</w:t>
             </w:r>
           </w:p>
         </w:tc>
@@ -5707,15 +6218,7 @@
               <w:rPr>
                 <w:sz w:val="19"/>
               </w:rPr>
-              <w:lastRenderedPageBreak/>
-              <w:t xml:space="preserve">0.778 ± </w:t>
-            </w:r>
-            <w:r>
-              <w:rPr>
-                <w:sz w:val="19"/>
-              </w:rPr>
-              <w:lastRenderedPageBreak/>
-              <w:t>0.080</w:t>
+              <w:t>0.778 ± 0.080</w:t>
             </w:r>
           </w:p>
         </w:tc>
@@ -5731,15 +6234,7 @@
               <w:rPr>
                 <w:sz w:val="19"/>
               </w:rPr>
-              <w:lastRenderedPageBreak/>
-              <w:t xml:space="preserve">0.882 ± </w:t>
-            </w:r>
-            <w:r>
-              <w:rPr>
-                <w:sz w:val="19"/>
-              </w:rPr>
-              <w:lastRenderedPageBreak/>
-              <w:t>0.053</w:t>
+              <w:t>0.882 ± 0.053</w:t>
             </w:r>
           </w:p>
         </w:tc>
@@ -5755,15 +6250,7 @@
               <w:rPr>
                 <w:sz w:val="19"/>
               </w:rPr>
-              <w:lastRenderedPageBreak/>
-              <w:t xml:space="preserve">0.810 ± </w:t>
-            </w:r>
-            <w:r>
-              <w:rPr>
-                <w:sz w:val="19"/>
-              </w:rPr>
-              <w:lastRenderedPageBreak/>
-              <w:t>0.059</w:t>
+              <w:t>0.810 ± 0.059</w:t>
             </w:r>
           </w:p>
         </w:tc>
@@ -5779,15 +6266,7 @@
               <w:rPr>
                 <w:sz w:val="19"/>
               </w:rPr>
-              <w:lastRenderedPageBreak/>
-              <w:t xml:space="preserve">0.126 ± </w:t>
-            </w:r>
-            <w:r>
-              <w:rPr>
-                <w:sz w:val="19"/>
-              </w:rPr>
-              <w:lastRenderedPageBreak/>
-              <w:t>0.020</w:t>
+              <w:t>0.126 ± 0.020</w:t>
             </w:r>
           </w:p>
         </w:tc>
@@ -5809,7 +6288,6 @@
               <w:rPr>
                 <w:sz w:val="19"/>
               </w:rPr>
-              <w:lastRenderedPageBreak/>
               <w:t>Gradient Boosting</w:t>
             </w:r>
           </w:p>
@@ -6326,6 +6804,7 @@
               <w:rPr>
                 <w:sz w:val="19"/>
               </w:rPr>
+              <w:lastRenderedPageBreak/>
               <w:t>Random Forest</w:t>
             </w:r>
           </w:p>
@@ -6460,7 +6939,15 @@
     </w:p>
     <w:p>
       <w:r>
-        <w:t>The highest pooled ROC AUC is the Bayesian network (0.910) and the highest accuracy is the SVM (84.9%), closely followed by Logistic Regression. Gradient Boosting is lowest on both (0.890, 81.8%). Logistic Regression and the SVM have the highest specificity (about 0.90) and the best Brier scores; all models have similar sensitivity (0.77-0.79).</w:t>
+        <w:t>The highest pooled ROC AUC is the Bayesian network (0.910</w:t>
+      </w:r>
+      <w:proofErr w:type="gramStart"/>
+      <w:r>
+        <w:t>)</w:t>
+      </w:r>
+      <w:proofErr w:type="gramEnd"/>
+      <w:r>
+        <w:t xml:space="preserve"> and the highest accuracy is the SVM (84.9%), closely followed by Logistic Regression. Gradient Boosting is lowest on both (0.890, 81.8%). Logistic Regression and the SVM have the highest specificity (about 0.90) and the best Brier scores; all models have similar sensitivity (0.77-0.79).</w:t>
       </w:r>
     </w:p>
     <w:p>
@@ -6731,7 +7218,6 @@
               <w:rPr>
                 <w:sz w:val="19"/>
               </w:rPr>
-              <w:lastRenderedPageBreak/>
               <w:t>Logistic Regression - Gradient Boosting</w:t>
             </w:r>
           </w:p>
@@ -7102,6 +7588,7 @@
         <w:rPr>
           <w:noProof/>
         </w:rPr>
+        <w:lastRenderedPageBreak/>
         <w:drawing>
           <wp:inline distT="0" distB="0" distL="0" distR="0" wp14:anchorId="695DB378" wp14:editId="4ABAF250">
             <wp:extent cx="5400000" cy="3348000"/>
@@ -7269,11 +7756,19 @@
             <w:pPr>
               <w:spacing w:after="0"/>
             </w:pPr>
-            <w:r>
-              <w:rPr>
-                <w:sz w:val="19"/>
-              </w:rPr>
-              <w:t>pseudo_count = 10</w:t>
+            <w:proofErr w:type="spellStart"/>
+            <w:r>
+              <w:rPr>
+                <w:sz w:val="19"/>
+              </w:rPr>
+              <w:t>pseudo_count</w:t>
+            </w:r>
+            <w:proofErr w:type="spellEnd"/>
+            <w:r>
+              <w:rPr>
+                <w:sz w:val="19"/>
+              </w:rPr>
+              <w:t xml:space="preserve"> = 10</w:t>
             </w:r>
           </w:p>
         </w:tc>
@@ -7487,11 +7982,33 @@
             <w:pPr>
               <w:spacing w:after="0"/>
             </w:pPr>
-            <w:r>
-              <w:rPr>
-                <w:sz w:val="19"/>
-              </w:rPr>
-              <w:t>n_estimators = 200, max_depth = 5</w:t>
+            <w:proofErr w:type="spellStart"/>
+            <w:r>
+              <w:rPr>
+                <w:sz w:val="19"/>
+              </w:rPr>
+              <w:t>n_estimators</w:t>
+            </w:r>
+            <w:proofErr w:type="spellEnd"/>
+            <w:r>
+              <w:rPr>
+                <w:sz w:val="19"/>
+              </w:rPr>
+              <w:t xml:space="preserve"> = 200, </w:t>
+            </w:r>
+            <w:proofErr w:type="spellStart"/>
+            <w:r>
+              <w:rPr>
+                <w:sz w:val="19"/>
+              </w:rPr>
+              <w:t>max_depth</w:t>
+            </w:r>
+            <w:proofErr w:type="spellEnd"/>
+            <w:r>
+              <w:rPr>
+                <w:sz w:val="19"/>
+              </w:rPr>
+              <w:t xml:space="preserve"> = 5</w:t>
             </w:r>
           </w:p>
         </w:tc>
@@ -7542,11 +8059,47 @@
             <w:pPr>
               <w:spacing w:after="0"/>
             </w:pPr>
-            <w:r>
-              <w:rPr>
-                <w:sz w:val="19"/>
-              </w:rPr>
-              <w:t>learning_rate = 0.05, n_estimators = 100, max_depth = 2</w:t>
+            <w:proofErr w:type="spellStart"/>
+            <w:r>
+              <w:rPr>
+                <w:sz w:val="19"/>
+              </w:rPr>
+              <w:t>learning_rate</w:t>
+            </w:r>
+            <w:proofErr w:type="spellEnd"/>
+            <w:r>
+              <w:rPr>
+                <w:sz w:val="19"/>
+              </w:rPr>
+              <w:t xml:space="preserve"> = 0.05, </w:t>
+            </w:r>
+            <w:proofErr w:type="spellStart"/>
+            <w:r>
+              <w:rPr>
+                <w:sz w:val="19"/>
+              </w:rPr>
+              <w:t>n_estimators</w:t>
+            </w:r>
+            <w:proofErr w:type="spellEnd"/>
+            <w:r>
+              <w:rPr>
+                <w:sz w:val="19"/>
+              </w:rPr>
+              <w:t xml:space="preserve"> = 100, </w:t>
+            </w:r>
+            <w:proofErr w:type="spellStart"/>
+            <w:r>
+              <w:rPr>
+                <w:sz w:val="19"/>
+              </w:rPr>
+              <w:t>max_depth</w:t>
+            </w:r>
+            <w:proofErr w:type="spellEnd"/>
+            <w:r>
+              <w:rPr>
+                <w:sz w:val="19"/>
+              </w:rPr>
+              <w:t xml:space="preserve"> = 2</w:t>
             </w:r>
           </w:p>
         </w:tc>
@@ -7585,7 +8138,6 @@
       </w:pPr>
       <w:bookmarkStart w:id="23" w:name="_Toc243918106"/>
       <w:r>
-        <w:lastRenderedPageBreak/>
         <w:t>10. Interpretation and feature importance</w:t>
       </w:r>
       <w:bookmarkEnd w:id="23"/>
@@ -7761,11 +8313,19 @@
             <w:pPr>
               <w:spacing w:after="0"/>
             </w:pPr>
-            <w:r>
-              <w:rPr>
-                <w:sz w:val="19"/>
-              </w:rPr>
-              <w:t>thal (0.054)</w:t>
+            <w:proofErr w:type="spellStart"/>
+            <w:r>
+              <w:rPr>
+                <w:sz w:val="19"/>
+              </w:rPr>
+              <w:t>thal</w:t>
+            </w:r>
+            <w:proofErr w:type="spellEnd"/>
+            <w:r>
+              <w:rPr>
+                <w:sz w:val="19"/>
+              </w:rPr>
+              <w:t xml:space="preserve"> (0.054)</w:t>
             </w:r>
           </w:p>
         </w:tc>
@@ -7803,6 +8363,7 @@
               <w:rPr>
                 <w:sz w:val="19"/>
               </w:rPr>
+              <w:lastRenderedPageBreak/>
               <w:t>2</w:t>
             </w:r>
           </w:p>
@@ -7816,11 +8377,19 @@
             <w:pPr>
               <w:spacing w:after="0"/>
             </w:pPr>
-            <w:r>
-              <w:rPr>
-                <w:sz w:val="19"/>
-              </w:rPr>
-              <w:t>thal (0.030)</w:t>
+            <w:proofErr w:type="spellStart"/>
+            <w:r>
+              <w:rPr>
+                <w:sz w:val="19"/>
+              </w:rPr>
+              <w:t>thal</w:t>
+            </w:r>
+            <w:proofErr w:type="spellEnd"/>
+            <w:r>
+              <w:rPr>
+                <w:sz w:val="19"/>
+              </w:rPr>
+              <w:t xml:space="preserve"> (0.030)</w:t>
             </w:r>
           </w:p>
         </w:tc>
@@ -7850,11 +8419,19 @@
             <w:pPr>
               <w:spacing w:after="0"/>
             </w:pPr>
-            <w:r>
-              <w:rPr>
-                <w:sz w:val="19"/>
-              </w:rPr>
-              <w:t>thal (0.046)</w:t>
+            <w:proofErr w:type="spellStart"/>
+            <w:r>
+              <w:rPr>
+                <w:sz w:val="19"/>
+              </w:rPr>
+              <w:t>thal</w:t>
+            </w:r>
+            <w:proofErr w:type="spellEnd"/>
+            <w:r>
+              <w:rPr>
+                <w:sz w:val="19"/>
+              </w:rPr>
+              <w:t xml:space="preserve"> (0.046)</w:t>
             </w:r>
           </w:p>
         </w:tc>
@@ -7958,11 +8535,19 @@
             <w:pPr>
               <w:spacing w:after="0"/>
             </w:pPr>
-            <w:r>
-              <w:rPr>
-                <w:sz w:val="19"/>
-              </w:rPr>
-              <w:t>thalach (0.012)</w:t>
+            <w:proofErr w:type="spellStart"/>
+            <w:r>
+              <w:rPr>
+                <w:sz w:val="19"/>
+              </w:rPr>
+              <w:t>thalach</w:t>
+            </w:r>
+            <w:proofErr w:type="spellEnd"/>
+            <w:r>
+              <w:rPr>
+                <w:sz w:val="19"/>
+              </w:rPr>
+              <w:t xml:space="preserve"> (0.012)</w:t>
             </w:r>
           </w:p>
         </w:tc>
@@ -8100,11 +8685,19 @@
             <w:pPr>
               <w:spacing w:after="0"/>
             </w:pPr>
-            <w:r>
-              <w:rPr>
-                <w:sz w:val="19"/>
-              </w:rPr>
-              <w:t>oldpeak (0.007)</w:t>
+            <w:proofErr w:type="spellStart"/>
+            <w:r>
+              <w:rPr>
+                <w:sz w:val="19"/>
+              </w:rPr>
+              <w:t>oldpeak</w:t>
+            </w:r>
+            <w:proofErr w:type="spellEnd"/>
+            <w:r>
+              <w:rPr>
+                <w:sz w:val="19"/>
+              </w:rPr>
+              <w:t xml:space="preserve"> (0.007)</w:t>
             </w:r>
           </w:p>
         </w:tc>
@@ -8117,11 +8710,19 @@
             <w:pPr>
               <w:spacing w:after="0"/>
             </w:pPr>
-            <w:r>
-              <w:rPr>
-                <w:sz w:val="19"/>
-              </w:rPr>
-              <w:t>oldpeak (0.006)</w:t>
+            <w:proofErr w:type="spellStart"/>
+            <w:r>
+              <w:rPr>
+                <w:sz w:val="19"/>
+              </w:rPr>
+              <w:t>oldpeak</w:t>
+            </w:r>
+            <w:proofErr w:type="spellEnd"/>
+            <w:r>
+              <w:rPr>
+                <w:sz w:val="19"/>
+              </w:rPr>
+              <w:t xml:space="preserve"> (0.006)</w:t>
             </w:r>
           </w:p>
         </w:tc>
@@ -8134,11 +8735,19 @@
             <w:pPr>
               <w:spacing w:after="0"/>
             </w:pPr>
-            <w:r>
-              <w:rPr>
-                <w:sz w:val="19"/>
-              </w:rPr>
-              <w:t>oldpeak (0.011)</w:t>
+            <w:proofErr w:type="spellStart"/>
+            <w:r>
+              <w:rPr>
+                <w:sz w:val="19"/>
+              </w:rPr>
+              <w:t>oldpeak</w:t>
+            </w:r>
+            <w:proofErr w:type="spellEnd"/>
+            <w:r>
+              <w:rPr>
+                <w:sz w:val="19"/>
+              </w:rPr>
+              <w:t xml:space="preserve"> (0.011)</w:t>
             </w:r>
           </w:p>
         </w:tc>
@@ -8216,8 +8825,17 @@
         <w:t>ca</w:t>
       </w:r>
       <w:r>
-        <w:t xml:space="preserve"> (vessels coloured by fluoroscopy), </w:t>
-      </w:r>
+        <w:t xml:space="preserve"> (vessels </w:t>
+      </w:r>
+      <w:proofErr w:type="spellStart"/>
+      <w:r>
+        <w:t>coloured</w:t>
+      </w:r>
+      <w:proofErr w:type="spellEnd"/>
+      <w:r>
+        <w:t xml:space="preserve"> by fluoroscopy), </w:t>
+      </w:r>
+      <w:proofErr w:type="spellStart"/>
       <w:r>
         <w:rPr>
           <w:rFonts w:ascii="Consolas" w:hAnsi="Consolas"/>
@@ -8225,6 +8843,7 @@
         </w:rPr>
         <w:t>thal</w:t>
       </w:r>
+      <w:proofErr w:type="spellEnd"/>
       <w:r>
         <w:t xml:space="preserve"> (thallium scan) and </w:t>
       </w:r>
@@ -8279,7 +8898,6 @@
       </w:pPr>
       <w:bookmarkStart w:id="26" w:name="_Toc243918109"/>
       <w:r>
-        <w:lastRenderedPageBreak/>
         <w:t>11. Software and web application</w:t>
       </w:r>
       <w:bookmarkEnd w:id="26"/>
@@ -8359,11 +8977,19 @@
             <w:pPr>
               <w:spacing w:after="0"/>
             </w:pPr>
-            <w:r>
-              <w:rPr>
-                <w:sz w:val="19"/>
-              </w:rPr>
-              <w:t>src/data/</w:t>
+            <w:proofErr w:type="spellStart"/>
+            <w:r>
+              <w:rPr>
+                <w:sz w:val="19"/>
+              </w:rPr>
+              <w:t>src</w:t>
+            </w:r>
+            <w:proofErr w:type="spellEnd"/>
+            <w:r>
+              <w:rPr>
+                <w:sz w:val="19"/>
+              </w:rPr>
+              <w:t>/data/</w:t>
             </w:r>
           </w:p>
         </w:tc>
@@ -8397,11 +9023,19 @@
             <w:pPr>
               <w:spacing w:after="0"/>
             </w:pPr>
-            <w:r>
-              <w:rPr>
-                <w:sz w:val="19"/>
-              </w:rPr>
-              <w:t>src/features/</w:t>
+            <w:proofErr w:type="spellStart"/>
+            <w:r>
+              <w:rPr>
+                <w:sz w:val="19"/>
+              </w:rPr>
+              <w:t>src</w:t>
+            </w:r>
+            <w:proofErr w:type="spellEnd"/>
+            <w:r>
+              <w:rPr>
+                <w:sz w:val="19"/>
+              </w:rPr>
+              <w:t>/features/</w:t>
             </w:r>
           </w:p>
         </w:tc>
@@ -8435,11 +9069,19 @@
             <w:pPr>
               <w:spacing w:after="0"/>
             </w:pPr>
-            <w:r>
-              <w:rPr>
-                <w:sz w:val="19"/>
-              </w:rPr>
-              <w:t>src/models/</w:t>
+            <w:proofErr w:type="spellStart"/>
+            <w:r>
+              <w:rPr>
+                <w:sz w:val="19"/>
+              </w:rPr>
+              <w:t>src</w:t>
+            </w:r>
+            <w:proofErr w:type="spellEnd"/>
+            <w:r>
+              <w:rPr>
+                <w:sz w:val="19"/>
+              </w:rPr>
+              <w:t>/models/</w:t>
             </w:r>
           </w:p>
         </w:tc>
@@ -8473,11 +9115,19 @@
             <w:pPr>
               <w:spacing w:after="0"/>
             </w:pPr>
-            <w:r>
-              <w:rPr>
-                <w:sz w:val="19"/>
-              </w:rPr>
-              <w:t>src/evaluation/</w:t>
+            <w:proofErr w:type="spellStart"/>
+            <w:r>
+              <w:rPr>
+                <w:sz w:val="19"/>
+              </w:rPr>
+              <w:t>src</w:t>
+            </w:r>
+            <w:proofErr w:type="spellEnd"/>
+            <w:r>
+              <w:rPr>
+                <w:sz w:val="19"/>
+              </w:rPr>
+              <w:t>/evaluation/</w:t>
             </w:r>
           </w:p>
         </w:tc>
@@ -8511,11 +9161,19 @@
             <w:pPr>
               <w:spacing w:after="0"/>
             </w:pPr>
-            <w:r>
-              <w:rPr>
-                <w:sz w:val="19"/>
-              </w:rPr>
-              <w:t>src/webapp/, app/</w:t>
+            <w:proofErr w:type="spellStart"/>
+            <w:r>
+              <w:rPr>
+                <w:sz w:val="19"/>
+              </w:rPr>
+              <w:t>src</w:t>
+            </w:r>
+            <w:proofErr w:type="spellEnd"/>
+            <w:r>
+              <w:rPr>
+                <w:sz w:val="19"/>
+              </w:rPr>
+              <w:t>/webapp/, app/</w:t>
             </w:r>
           </w:p>
         </w:tc>
@@ -8527,11 +9185,19 @@
             <w:pPr>
               <w:spacing w:after="0"/>
             </w:pPr>
-            <w:r>
-              <w:rPr>
-                <w:sz w:val="19"/>
-              </w:rPr>
-              <w:t>Streamlit web application and its logic</w:t>
+            <w:proofErr w:type="spellStart"/>
+            <w:r>
+              <w:rPr>
+                <w:sz w:val="19"/>
+              </w:rPr>
+              <w:t>Streamlit</w:t>
+            </w:r>
+            <w:proofErr w:type="spellEnd"/>
+            <w:r>
+              <w:rPr>
+                <w:sz w:val="19"/>
+              </w:rPr>
+              <w:t xml:space="preserve"> web application and its logic</w:t>
             </w:r>
           </w:p>
         </w:tc>
@@ -8624,10 +9290,31 @@
           <w:rFonts w:ascii="Consolas" w:hAnsi="Consolas"/>
           <w:sz w:val="20"/>
         </w:rPr>
-        <w:t>python -m src.evaluation.run_evaluation</w:t>
-      </w:r>
-      <w:r>
-        <w:t xml:space="preserve"> trains and evaluates all six models on the same folds and writes every table and figure. The five-page Streamlit app (Overview, Data explorer, Model results, Risk estimator, Methods and limitations) shows the saved results and lets a user try all six models on a hypothetical patient. Every page carries a not-a-medical-device disclaimer; inputs are validated, nothing entered is stored and usage telemetry is off.</w:t>
+        <w:t xml:space="preserve">python -m </w:t>
+      </w:r>
+      <w:proofErr w:type="spellStart"/>
+      <w:r>
+        <w:rPr>
+          <w:rFonts w:ascii="Consolas" w:hAnsi="Consolas"/>
+          <w:sz w:val="20"/>
+        </w:rPr>
+        <w:t>src.evaluation.run_evaluation</w:t>
+      </w:r>
+      <w:proofErr w:type="spellEnd"/>
+      <w:r>
+        <w:t xml:space="preserve"> trains and evaluates all six models on the same folds and writes every table and figure. The five-page </w:t>
+      </w:r>
+      <w:proofErr w:type="spellStart"/>
+      <w:r>
+        <w:t>Streamlit</w:t>
+      </w:r>
+      <w:proofErr w:type="spellEnd"/>
+      <w:r>
+        <w:t xml:space="preserve"> app (Overview, Data explorer, Model results, Risk estimator, Methods and limitations) shows the saved results and lets a user try all six models on a </w:t>
+      </w:r>
+      <w:r>
+        <w:lastRenderedPageBreak/>
+        <w:t>hypothetical patient. Every page carries a not-a-medical-device disclaimer; inputs are validated, nothing entered is stored and usage telemetry is off.</w:t>
       </w:r>
     </w:p>
     <w:p>
@@ -8724,10 +9411,32 @@
         <w:rPr>
           <w:b/>
         </w:rPr>
-        <w:t>Small, single-centre data:</w:t>
-      </w:r>
-      <w:r>
-        <w:t xml:space="preserve"> 303 patients from one centre and period, with internal validation only.</w:t>
+        <w:t>Small, single-</w:t>
+      </w:r>
+      <w:proofErr w:type="spellStart"/>
+      <w:r>
+        <w:rPr>
+          <w:b/>
+        </w:rPr>
+        <w:t>centre</w:t>
+      </w:r>
+      <w:proofErr w:type="spellEnd"/>
+      <w:r>
+        <w:rPr>
+          <w:b/>
+        </w:rPr>
+        <w:t xml:space="preserve"> data:</w:t>
+      </w:r>
+      <w:r>
+        <w:t xml:space="preserve"> 303 patients from one </w:t>
+      </w:r>
+      <w:proofErr w:type="spellStart"/>
+      <w:r>
+        <w:t>centre</w:t>
+      </w:r>
+      <w:proofErr w:type="spellEnd"/>
+      <w:r>
+        <w:t xml:space="preserve"> and period, with internal validation only.</w:t>
       </w:r>
     </w:p>
     <w:p>
@@ -8754,7 +9463,6 @@
         <w:rPr>
           <w:b/>
         </w:rPr>
-        <w:lastRenderedPageBreak/>
         <w:t>Specialist predictors:</w:t>
       </w:r>
       <w:r>
@@ -8863,10 +9571,11 @@
     </w:p>
     <w:p>
       <w:r>
-        <w:t>Under an identical, leakage-safe nested cross-validation on 303 Cleveland patients, six classical machine-learning models all predict angiographic heart disease well (ROC AUC 0.890-0.910, accuracy 81.8%-84.9%). Five of them cannot be told apart, and Gradient Boosting is slightly behind. Simple, interpretable models (Logistic Regression, the Bayesian network) do as well as the ensembles on this small tabular dataset. These are internal, exploratory estimates for an academic comparison; no clinical usefulness</w:t>
-      </w:r>
-      <w:r>
-        <w:t xml:space="preserve"> is claimed.</w:t>
+        <w:t xml:space="preserve">Under an identical, leakage-safe nested cross-validation on 303 Cleveland patients, six classical machine-learning models all predict angiographic heart disease well (ROC AUC 0.890-0.910, accuracy </w:t>
+      </w:r>
+      <w:r>
+        <w:lastRenderedPageBreak/>
+        <w:t>81.8%-84.9%). Five of them cannot be told apart, and Gradient Boosting is slightly behind. Simple, interpretable models (Logistic Regression, the Bayesian network) do as well as the ensembles on this small tabular dataset. These are internal, exploratory estimates for an academic comparison; no clinical usefulness is claimed.</w:t>
       </w:r>
     </w:p>
     <w:p>
@@ -8880,7 +9589,15 @@
         <w:spacing w:after="60"/>
       </w:pPr>
       <w:r>
-        <w:t>Phase 2: add a neural network and compare it on exactly the same folds.</w:t>
+        <w:t xml:space="preserve">Phase 2: add a neural network and compare it on </w:t>
+      </w:r>
+      <w:proofErr w:type="gramStart"/>
+      <w:r>
+        <w:t>exactly the same</w:t>
+      </w:r>
+      <w:proofErr w:type="gramEnd"/>
+      <w:r>
+        <w:t xml:space="preserve"> folds.</w:t>
       </w:r>
     </w:p>
     <w:p>
@@ -8936,13 +9653,30 @@
           <w:sz w:val="19"/>
         </w:rPr>
         <w:tab/>
-      </w:r>
+        <w:t xml:space="preserve">E. W. </w:t>
+      </w:r>
+      <w:proofErr w:type="spellStart"/>
       <w:r>
         <w:rPr>
           <w:sz w:val="19"/>
         </w:rPr>
-        <w:t>E. W. Steyerberg et al., "Assessing the performance of prediction models: A framework for traditional and novel measures," Epidemiology, 2010. doi:10.1097/EDE.0b013e3181c30fb2</w:t>
-      </w:r>
+        <w:t>Steyerberg</w:t>
+      </w:r>
+      <w:proofErr w:type="spellEnd"/>
+      <w:r>
+        <w:rPr>
+          <w:sz w:val="19"/>
+        </w:rPr>
+        <w:t xml:space="preserve"> et al., "Assessing the performance of prediction models: A framework for traditional and novel measures," Epidemiology, 2010. </w:t>
+      </w:r>
+      <w:proofErr w:type="gramStart"/>
+      <w:r>
+        <w:rPr>
+          <w:sz w:val="19"/>
+        </w:rPr>
+        <w:t>doi:10.1097/EDE.0b013e3181c30fb2</w:t>
+      </w:r>
+      <w:proofErr w:type="gramEnd"/>
     </w:p>
     <w:p>
       <w:pPr>
@@ -8960,7 +9694,21 @@
           <w:sz w:val="19"/>
         </w:rPr>
         <w:tab/>
-        <w:t>R. Detrano et al., "International application of a new probability algorithm for the diagnosis of coronary artery disease," Amer. J. Cardiol., 1989. doi:10.1016/0002-9149(89)90524-9</w:t>
+        <w:t xml:space="preserve">R. Detrano et al., "International application of a new probability algorithm for the diagnosis of coronary artery disease," Amer. J. </w:t>
+      </w:r>
+      <w:proofErr w:type="spellStart"/>
+      <w:r>
+        <w:rPr>
+          <w:sz w:val="19"/>
+        </w:rPr>
+        <w:t>Cardiol</w:t>
+      </w:r>
+      <w:proofErr w:type="spellEnd"/>
+      <w:r>
+        <w:rPr>
+          <w:sz w:val="19"/>
+        </w:rPr>
+        <w:t>., 1989. doi:10.1016/0002-9149(89)90524-9</w:t>
       </w:r>
     </w:p>
     <w:p>
@@ -8979,7 +9727,21 @@
           <w:sz w:val="19"/>
         </w:rPr>
         <w:tab/>
-        <w:t>A. Janosi, W. Steinbrunn, M. Pfisterer and R. Detrano, "Heart Disease" [Dataset], UCI Machine Learning Repository, 1989. doi:10.24432/C52P4X</w:t>
+        <w:t>A. Janosi, W. Steinbrunn, M. Pfisterer and R. Detrano, "</w:t>
+      </w:r>
+      <w:proofErr w:type="gramStart"/>
+      <w:r>
+        <w:rPr>
+          <w:sz w:val="19"/>
+        </w:rPr>
+        <w:t>Heart Disease</w:t>
+      </w:r>
+      <w:proofErr w:type="gramEnd"/>
+      <w:r>
+        <w:rPr>
+          <w:sz w:val="19"/>
+        </w:rPr>
+        <w:t>" [Dataset], UCI Machine Learning Repository, 1989. doi:10.24432/C52P4X</w:t>
       </w:r>
     </w:p>
     <w:p>
@@ -8998,11 +9760,6 @@
           <w:sz w:val="19"/>
         </w:rPr>
         <w:tab/>
-      </w:r>
-      <w:r>
-        <w:rPr>
-          <w:sz w:val="19"/>
-        </w:rPr>
         <w:t>J. Pearl, Probabilistic Reasoning in Intelligent Systems: Networks of Plausible Inference. Morgan Kaufmann, 1988.</w:t>
       </w:r>
     </w:p>
@@ -9060,12 +9817,21 @@
           <w:sz w:val="19"/>
         </w:rPr>
         <w:tab/>
-      </w:r>
+        <w:t xml:space="preserve">P. Domingos and M. </w:t>
+      </w:r>
+      <w:proofErr w:type="spellStart"/>
       <w:r>
         <w:rPr>
           <w:sz w:val="19"/>
         </w:rPr>
-        <w:t>P. Domingos and M. Pazzani, "On the optimality of the simple Bayesian classifier under zero-one loss," Mach. Learn., 1997. doi:10.1023/A:1007413511361</w:t>
+        <w:t>Pazzani</w:t>
+      </w:r>
+      <w:proofErr w:type="spellEnd"/>
+      <w:r>
+        <w:rPr>
+          <w:sz w:val="19"/>
+        </w:rPr>
+        <w:t>, "On the optimality of the simple Bayesian classifier under zero-one loss," Mach. Learn., 1997. doi:10.1023/A:1007413511361</w:t>
       </w:r>
     </w:p>
     <w:p>
@@ -9084,7 +9850,21 @@
           <w:sz w:val="19"/>
         </w:rPr>
         <w:tab/>
-        <w:t>D. W. Hosmer, S. Lemeshow and R. X. Sturdivant, Applied Logistic Regression, 3rd ed. Wiley, 2013.</w:t>
+        <w:t xml:space="preserve">D. W. Hosmer, S. </w:t>
+      </w:r>
+      <w:proofErr w:type="spellStart"/>
+      <w:r>
+        <w:rPr>
+          <w:sz w:val="19"/>
+        </w:rPr>
+        <w:t>Lemeshow</w:t>
+      </w:r>
+      <w:proofErr w:type="spellEnd"/>
+      <w:r>
+        <w:rPr>
+          <w:sz w:val="19"/>
+        </w:rPr>
+        <w:t xml:space="preserve"> and R. X. Sturdivant, Applied Logistic Regression, 3rd ed. Wiley, 2013.</w:t>
       </w:r>
     </w:p>
     <w:p>
@@ -9103,7 +9883,21 @@
           <w:sz w:val="19"/>
         </w:rPr>
         <w:tab/>
-        <w:t>C. Cortes and V. Vapnik, "Support-vector networks," Mach. Learn., 1995. doi:10.1007/BF00994018</w:t>
+        <w:t xml:space="preserve">C. Cortes and V. </w:t>
+      </w:r>
+      <w:proofErr w:type="spellStart"/>
+      <w:r>
+        <w:rPr>
+          <w:sz w:val="19"/>
+        </w:rPr>
+        <w:t>Vapnik</w:t>
+      </w:r>
+      <w:proofErr w:type="spellEnd"/>
+      <w:r>
+        <w:rPr>
+          <w:sz w:val="19"/>
+        </w:rPr>
+        <w:t>, "Support-vector networks," Mach. Learn., 1995. doi:10.1007/BF00994018</w:t>
       </w:r>
     </w:p>
     <w:p>
@@ -9122,11 +9916,6 @@
           <w:sz w:val="19"/>
         </w:rPr>
         <w:tab/>
-      </w:r>
-      <w:r>
-        <w:rPr>
-          <w:sz w:val="19"/>
-        </w:rPr>
         <w:t>J. Platt, "Probabilistic outputs for support vector machines and comparisons to regularized likelihood methods," in Advances in Large Margin Classifiers. MIT Press, 1999.</w:t>
       </w:r>
     </w:p>
@@ -9146,7 +9935,21 @@
           <w:sz w:val="19"/>
         </w:rPr>
         <w:tab/>
-        <w:t>L. Breiman, "Random forests," Mach. Learn., 2001. doi:10.1023/A:1010933404324</w:t>
+        <w:t xml:space="preserve">L. </w:t>
+      </w:r>
+      <w:proofErr w:type="spellStart"/>
+      <w:r>
+        <w:rPr>
+          <w:sz w:val="19"/>
+        </w:rPr>
+        <w:t>Breiman</w:t>
+      </w:r>
+      <w:proofErr w:type="spellEnd"/>
+      <w:r>
+        <w:rPr>
+          <w:sz w:val="19"/>
+        </w:rPr>
+        <w:t>, "Random forests," Mach. Learn., 2001. doi:10.1023/A:1010933404324</w:t>
       </w:r>
     </w:p>
     <w:p>
@@ -9158,7 +9961,6 @@
         <w:rPr>
           <w:sz w:val="19"/>
         </w:rPr>
-        <w:lastRenderedPageBreak/>
         <w:t>[12]</w:t>
       </w:r>
       <w:r>
@@ -9166,7 +9968,21 @@
           <w:sz w:val="19"/>
         </w:rPr>
         <w:tab/>
-        <w:t>J. H. Friedman, "Greedy function approximation: A gradient boosting machine," Ann. Statist., 2001. doi:10.1214/aos/1013203451</w:t>
+        <w:t>J. H. Friedman, "Greedy function approximation: A gradient boosting machine," Ann. Statist., 2001. doi:10.1214/</w:t>
+      </w:r>
+      <w:proofErr w:type="spellStart"/>
+      <w:r>
+        <w:rPr>
+          <w:sz w:val="19"/>
+        </w:rPr>
+        <w:t>aos</w:t>
+      </w:r>
+      <w:proofErr w:type="spellEnd"/>
+      <w:r>
+        <w:rPr>
+          <w:sz w:val="19"/>
+        </w:rPr>
+        <w:t>/1013203451</w:t>
       </w:r>
     </w:p>
     <w:p>
@@ -9185,12 +10001,63 @@
           <w:sz w:val="19"/>
         </w:rPr>
         <w:tab/>
-      </w:r>
+        <w:t xml:space="preserve">L. </w:t>
+      </w:r>
+      <w:proofErr w:type="spellStart"/>
       <w:r>
         <w:rPr>
           <w:sz w:val="19"/>
         </w:rPr>
-        <w:t>L. Grinsztajn, E. Oyallon and G. Varoquaux, "Why do tree-based models still outperform deep learning on tabular data?" NeurIPS Datasets and Benchmarks, 2022.</w:t>
+        <w:t>Grinsztajn</w:t>
+      </w:r>
+      <w:proofErr w:type="spellEnd"/>
+      <w:r>
+        <w:rPr>
+          <w:sz w:val="19"/>
+        </w:rPr>
+        <w:t xml:space="preserve">, E. </w:t>
+      </w:r>
+      <w:proofErr w:type="spellStart"/>
+      <w:r>
+        <w:rPr>
+          <w:sz w:val="19"/>
+        </w:rPr>
+        <w:t>Oyallon</w:t>
+      </w:r>
+      <w:proofErr w:type="spellEnd"/>
+      <w:r>
+        <w:rPr>
+          <w:sz w:val="19"/>
+        </w:rPr>
+        <w:t xml:space="preserve"> and G. </w:t>
+      </w:r>
+      <w:proofErr w:type="spellStart"/>
+      <w:r>
+        <w:rPr>
+          <w:sz w:val="19"/>
+        </w:rPr>
+        <w:t>Varoquaux</w:t>
+      </w:r>
+      <w:proofErr w:type="spellEnd"/>
+      <w:r>
+        <w:rPr>
+          <w:sz w:val="19"/>
+        </w:rPr>
+        <w:t xml:space="preserve">, "Why do tree-based models still outperform deep learning on tabular data?" </w:t>
+      </w:r>
+      <w:proofErr w:type="spellStart"/>
+      <w:r>
+        <w:rPr>
+          <w:sz w:val="19"/>
+        </w:rPr>
+        <w:t>NeurIPS</w:t>
+      </w:r>
+      <w:proofErr w:type="spellEnd"/>
+      <w:r>
+        <w:rPr>
+          <w:sz w:val="19"/>
+        </w:rPr>
+        <w:t xml:space="preserve"> Datasets and Benchmarks, 2022.</w:t>
       </w:r>
     </w:p>
     <w:p>
@@ -9247,12 +10114,21 @@
           <w:sz w:val="19"/>
         </w:rPr>
         <w:tab/>
-      </w:r>
+        <w:t xml:space="preserve">S. Kapoor and A. Narayanan, "Leakage and the reproducibility crisis in machine-learning-based science," Patterns, 2023. </w:t>
+      </w:r>
+      <w:proofErr w:type="gramStart"/>
       <w:r>
         <w:rPr>
           <w:sz w:val="19"/>
         </w:rPr>
-        <w:t>S. Kapoor and A. Narayanan, "Leakage and the reproducibility crisis in machine-learning-based science," Patterns, 2023. doi:10.1016/j.patter.2023.100804</w:t>
+        <w:t>doi:10.1016/j.patter</w:t>
+      </w:r>
+      <w:proofErr w:type="gramEnd"/>
+      <w:r>
+        <w:rPr>
+          <w:sz w:val="19"/>
+        </w:rPr>
+        <w:t>.2023.100804</w:t>
       </w:r>
     </w:p>
     <w:p>
@@ -9271,7 +10147,35 @@
           <w:sz w:val="19"/>
         </w:rPr>
         <w:tab/>
-        <w:t>T. Fawcett, "An introduction to ROC analysis," Pattern Recognit. Lett., 2006. doi:10.1016/j.patrec.2005.10.010</w:t>
+        <w:t xml:space="preserve">T. Fawcett, "An introduction to ROC analysis," Pattern </w:t>
+      </w:r>
+      <w:proofErr w:type="spellStart"/>
+      <w:r>
+        <w:rPr>
+          <w:sz w:val="19"/>
+        </w:rPr>
+        <w:t>Recognit</w:t>
+      </w:r>
+      <w:proofErr w:type="spellEnd"/>
+      <w:r>
+        <w:rPr>
+          <w:sz w:val="19"/>
+        </w:rPr>
+        <w:t xml:space="preserve">. Lett., 2006. </w:t>
+      </w:r>
+      <w:proofErr w:type="gramStart"/>
+      <w:r>
+        <w:rPr>
+          <w:sz w:val="19"/>
+        </w:rPr>
+        <w:t>doi:10.1016/j.patrec</w:t>
+      </w:r>
+      <w:proofErr w:type="gramEnd"/>
+      <w:r>
+        <w:rPr>
+          <w:sz w:val="19"/>
+        </w:rPr>
+        <w:t>.2005.10.010</w:t>
       </w:r>
     </w:p>
     <w:p>
@@ -9309,7 +10213,21 @@
           <w:sz w:val="19"/>
         </w:rPr>
         <w:tab/>
-        <w:t>B. Efron and R. J. Tibshirani, An Introduction to the Bootstrap. Chapman &amp; Hall, 1993.</w:t>
+        <w:t xml:space="preserve">B. Efron and R. J. </w:t>
+      </w:r>
+      <w:proofErr w:type="spellStart"/>
+      <w:r>
+        <w:rPr>
+          <w:sz w:val="19"/>
+        </w:rPr>
+        <w:t>Tibshirani</w:t>
+      </w:r>
+      <w:proofErr w:type="spellEnd"/>
+      <w:r>
+        <w:rPr>
+          <w:sz w:val="19"/>
+        </w:rPr>
+        <w:t>, An Introduction to the Bootstrap. Chapman &amp; Hall, 1993.</w:t>
       </w:r>
     </w:p>
     <w:p>
@@ -9328,12 +10246,21 @@
           <w:sz w:val="19"/>
         </w:rPr>
         <w:tab/>
-      </w:r>
+        <w:t>A. Ankan and A. Panda, "</w:t>
+      </w:r>
+      <w:proofErr w:type="spellStart"/>
       <w:r>
         <w:rPr>
           <w:sz w:val="19"/>
         </w:rPr>
-        <w:t>A. Ankan and A. Panda, "pgmpy: Probabilistic graphical models using Python," Proc. SciPy, 2015. doi:10.25080/Majora-7b98e3ed-001</w:t>
+        <w:t>pgmpy</w:t>
+      </w:r>
+      <w:proofErr w:type="spellEnd"/>
+      <w:r>
+        <w:rPr>
+          <w:sz w:val="19"/>
+        </w:rPr>
+        <w:t>: Probabilistic graphical models using Python," Proc. SciPy, 2015. doi:10.25080/Majora-7b98e3ed-001</w:t>
       </w:r>
     </w:p>
     <w:p>
@@ -9364,6 +10291,7 @@
         <w:rPr>
           <w:sz w:val="19"/>
         </w:rPr>
+        <w:lastRenderedPageBreak/>
         <w:t>[22]</w:t>
       </w:r>
       <w:r>
@@ -9371,7 +10299,21 @@
           <w:sz w:val="19"/>
         </w:rPr>
         <w:tab/>
-        <w:t>C. Rudin, "Stop explaining black box machine learning models for high stakes decisions and use interpretable models instead," Nat. Mach. Intell., 2019. doi:10.1038/s42256-019-0048-x</w:t>
+        <w:t xml:space="preserve">C. Rudin, "Stop explaining black box machine learning models for </w:t>
+      </w:r>
+      <w:proofErr w:type="gramStart"/>
+      <w:r>
+        <w:rPr>
+          <w:sz w:val="19"/>
+        </w:rPr>
+        <w:t>high stakes</w:t>
+      </w:r>
+      <w:proofErr w:type="gramEnd"/>
+      <w:r>
+        <w:rPr>
+          <w:sz w:val="19"/>
+        </w:rPr>
+        <w:t xml:space="preserve"> decisions and use interpretable models instead," Nat. Mach. Intell., 2019. doi:10.1038/s42256-019-0048-x</w:t>
       </w:r>
     </w:p>
     <w:p>
@@ -9390,11 +10332,6 @@
           <w:sz w:val="19"/>
         </w:rPr>
         <w:tab/>
-      </w:r>
-      <w:r>
-        <w:rPr>
-          <w:sz w:val="19"/>
-        </w:rPr>
         <w:t>G. S. Collins, J. B. Reitsma, D. G. Altman and K. G. M. Moons, "Transparent reporting of a multivariable prediction model for individual prognosis or diagnosis (TRIPOD)," Ann. Intern. Med., 2015. doi:10.7326/M14-0697</w:t>
       </w:r>
     </w:p>
@@ -9595,7 +10532,21 @@
               <w:rPr>
                 <w:sz w:val="19"/>
               </w:rPr>
-              <w:t>Theoretical rigour (probabilistic graphical models)</w:t>
+              <w:t xml:space="preserve">Theoretical </w:t>
+            </w:r>
+            <w:proofErr w:type="spellStart"/>
+            <w:r>
+              <w:rPr>
+                <w:sz w:val="19"/>
+              </w:rPr>
+              <w:t>rigour</w:t>
+            </w:r>
+            <w:proofErr w:type="spellEnd"/>
+            <w:r>
+              <w:rPr>
+                <w:sz w:val="19"/>
+              </w:rPr>
+              <w:t xml:space="preserve"> (probabilistic graphical models)</w:t>
             </w:r>
           </w:p>
         </w:tc>
@@ -9803,7 +10754,66 @@
           <w:rFonts w:ascii="Consolas" w:hAnsi="Consolas"/>
           <w:sz w:val="19"/>
         </w:rPr>
-        <w:t>python3 -m venv .venv &amp;&amp; source .venv/bin/activate</w:t>
+        <w:t xml:space="preserve">python3 -m </w:t>
+      </w:r>
+      <w:proofErr w:type="spellStart"/>
+      <w:proofErr w:type="gramStart"/>
+      <w:r>
+        <w:rPr>
+          <w:rFonts w:ascii="Consolas" w:hAnsi="Consolas"/>
+          <w:sz w:val="19"/>
+        </w:rPr>
+        <w:t>venv</w:t>
+      </w:r>
+      <w:proofErr w:type="spellEnd"/>
+      <w:r>
+        <w:rPr>
+          <w:rFonts w:ascii="Consolas" w:hAnsi="Consolas"/>
+          <w:sz w:val="19"/>
+        </w:rPr>
+        <w:t xml:space="preserve"> .</w:t>
+      </w:r>
+      <w:proofErr w:type="spellStart"/>
+      <w:r>
+        <w:rPr>
+          <w:rFonts w:ascii="Consolas" w:hAnsi="Consolas"/>
+          <w:sz w:val="19"/>
+        </w:rPr>
+        <w:t>venv</w:t>
+      </w:r>
+      <w:proofErr w:type="spellEnd"/>
+      <w:proofErr w:type="gramEnd"/>
+      <w:r>
+        <w:rPr>
+          <w:rFonts w:ascii="Consolas" w:hAnsi="Consolas"/>
+          <w:sz w:val="19"/>
+        </w:rPr>
+        <w:t xml:space="preserve"> &amp;&amp; </w:t>
+      </w:r>
+      <w:proofErr w:type="gramStart"/>
+      <w:r>
+        <w:rPr>
+          <w:rFonts w:ascii="Consolas" w:hAnsi="Consolas"/>
+          <w:sz w:val="19"/>
+        </w:rPr>
+        <w:t>source .</w:t>
+      </w:r>
+      <w:proofErr w:type="spellStart"/>
+      <w:r>
+        <w:rPr>
+          <w:rFonts w:ascii="Consolas" w:hAnsi="Consolas"/>
+          <w:sz w:val="19"/>
+        </w:rPr>
+        <w:t>venv</w:t>
+      </w:r>
+      <w:proofErr w:type="spellEnd"/>
+      <w:proofErr w:type="gramEnd"/>
+      <w:r>
+        <w:rPr>
+          <w:rFonts w:ascii="Consolas" w:hAnsi="Consolas"/>
+          <w:sz w:val="19"/>
+        </w:rPr>
+        <w:t>/bin/activate</w:t>
       </w:r>
     </w:p>
     <w:p>
@@ -9829,8 +10839,26 @@
           <w:rFonts w:ascii="Consolas" w:hAnsi="Consolas"/>
           <w:sz w:val="19"/>
         </w:rPr>
-        <w:t>python -m src.data.verify</w:t>
-      </w:r>
+        <w:t xml:space="preserve">python -m </w:t>
+      </w:r>
+      <w:proofErr w:type="spellStart"/>
+      <w:r>
+        <w:rPr>
+          <w:rFonts w:ascii="Consolas" w:hAnsi="Consolas"/>
+          <w:sz w:val="19"/>
+        </w:rPr>
+        <w:t>src.</w:t>
+      </w:r>
+      <w:proofErr w:type="gramStart"/>
+      <w:r>
+        <w:rPr>
+          <w:rFonts w:ascii="Consolas" w:hAnsi="Consolas"/>
+          <w:sz w:val="19"/>
+        </w:rPr>
+        <w:t>data.verify</w:t>
+      </w:r>
+      <w:proofErr w:type="spellEnd"/>
+      <w:proofErr w:type="gramEnd"/>
     </w:p>
     <w:p>
       <w:pPr>
@@ -9842,8 +10870,17 @@
           <w:rFonts w:ascii="Consolas" w:hAnsi="Consolas"/>
           <w:sz w:val="19"/>
         </w:rPr>
-        <w:t>python -m src.data.eda</w:t>
-      </w:r>
+        <w:t xml:space="preserve">python -m </w:t>
+      </w:r>
+      <w:proofErr w:type="spellStart"/>
+      <w:r>
+        <w:rPr>
+          <w:rFonts w:ascii="Consolas" w:hAnsi="Consolas"/>
+          <w:sz w:val="19"/>
+        </w:rPr>
+        <w:t>src.data.eda</w:t>
+      </w:r>
+      <w:proofErr w:type="spellEnd"/>
     </w:p>
     <w:p>
       <w:pPr>
@@ -9855,7 +10892,23 @@
           <w:rFonts w:ascii="Consolas" w:hAnsi="Consolas"/>
           <w:sz w:val="19"/>
         </w:rPr>
-        <w:t>python -m src.evaluation.run_evaluation      # about 10 minutes</w:t>
+        <w:t xml:space="preserve">python -m </w:t>
+      </w:r>
+      <w:proofErr w:type="spellStart"/>
+      <w:r>
+        <w:rPr>
+          <w:rFonts w:ascii="Consolas" w:hAnsi="Consolas"/>
+          <w:sz w:val="19"/>
+        </w:rPr>
+        <w:t>src.evaluation.run_evaluation</w:t>
+      </w:r>
+      <w:proofErr w:type="spellEnd"/>
+      <w:r>
+        <w:rPr>
+          <w:rFonts w:ascii="Consolas" w:hAnsi="Consolas"/>
+          <w:sz w:val="19"/>
+        </w:rPr>
+        <w:t xml:space="preserve">      # about 10 minutes</w:t>
       </w:r>
     </w:p>
     <w:p>
@@ -9868,8 +10921,26 @@
           <w:rFonts w:ascii="Consolas" w:hAnsi="Consolas"/>
           <w:sz w:val="19"/>
         </w:rPr>
-        <w:t>python -m src.evaluation.interpret</w:t>
-      </w:r>
+        <w:t xml:space="preserve">python -m </w:t>
+      </w:r>
+      <w:proofErr w:type="spellStart"/>
+      <w:proofErr w:type="gramStart"/>
+      <w:r>
+        <w:rPr>
+          <w:rFonts w:ascii="Consolas" w:hAnsi="Consolas"/>
+          <w:sz w:val="19"/>
+        </w:rPr>
+        <w:t>src.evaluation</w:t>
+      </w:r>
+      <w:proofErr w:type="gramEnd"/>
+      <w:r>
+        <w:rPr>
+          <w:rFonts w:ascii="Consolas" w:hAnsi="Consolas"/>
+          <w:sz w:val="19"/>
+        </w:rPr>
+        <w:t>.interpret</w:t>
+      </w:r>
+      <w:proofErr w:type="spellEnd"/>
     </w:p>
     <w:p>
       <w:pPr>
@@ -9881,7 +10952,23 @@
           <w:rFonts w:ascii="Consolas" w:hAnsi="Consolas"/>
           <w:sz w:val="19"/>
         </w:rPr>
-        <w:t>python -m pytest -q</w:t>
+        <w:t xml:space="preserve">python -m </w:t>
+      </w:r>
+      <w:proofErr w:type="spellStart"/>
+      <w:r>
+        <w:rPr>
+          <w:rFonts w:ascii="Consolas" w:hAnsi="Consolas"/>
+          <w:sz w:val="19"/>
+        </w:rPr>
+        <w:t>pytest</w:t>
+      </w:r>
+      <w:proofErr w:type="spellEnd"/>
+      <w:r>
+        <w:rPr>
+          <w:rFonts w:ascii="Consolas" w:hAnsi="Consolas"/>
+          <w:sz w:val="19"/>
+        </w:rPr>
+        <w:t xml:space="preserve"> -q</w:t>
       </w:r>
     </w:p>
     <w:p>
@@ -9889,12 +10976,21 @@
         <w:spacing w:after="0"/>
         <w:ind w:left="340"/>
       </w:pPr>
+      <w:proofErr w:type="spellStart"/>
       <w:r>
         <w:rPr>
           <w:rFonts w:ascii="Consolas" w:hAnsi="Consolas"/>
           <w:sz w:val="19"/>
         </w:rPr>
-        <w:t>streamlit run app/streamlit_app.py</w:t>
+        <w:t>streamlit</w:t>
+      </w:r>
+      <w:proofErr w:type="spellEnd"/>
+      <w:r>
+        <w:rPr>
+          <w:rFonts w:ascii="Consolas" w:hAnsi="Consolas"/>
+          <w:sz w:val="19"/>
+        </w:rPr>
+        <w:t xml:space="preserve"> run app/streamlit_app.py</w:t>
       </w:r>
     </w:p>
     <w:sectPr>
@@ -9945,7 +11041,23 @@
         <w:color w:val="5B6475"/>
         <w:sz w:val="18"/>
       </w:rPr>
-      <w:t xml:space="preserve">Heart Disease Risk Modelling  ·  page </w:t>
+      <w:t xml:space="preserve">Heart Disease Risk </w:t>
+    </w:r>
+    <w:proofErr w:type="gramStart"/>
+    <w:r>
+      <w:rPr>
+        <w:color w:val="5B6475"/>
+        <w:sz w:val="18"/>
+      </w:rPr>
+      <w:t>Modelling  ·</w:t>
+    </w:r>
+    <w:proofErr w:type="gramEnd"/>
+    <w:r>
+      <w:rPr>
+        <w:color w:val="5B6475"/>
+        <w:sz w:val="18"/>
+      </w:rPr>
+      <w:t xml:space="preserve">  page </w:t>
     </w:r>
     <w:r>
       <w:rPr>

</xml_diff>